<commit_message>
1.3.6-rasm S&P 2024 (1981-2024) ma'lumotlari bilan yangilandi, alohida PNG
Co-Authored-By: Claude Opus 5.5 <noreply@anthropic.com>
Claude-Session: https://claude.ai/code/session_01PxHTC8Q7yHdrpAeUA5KUgM
</commit_message>
<xml_diff>
--- a/paragraflar/1.3-paragraf.docx
+++ b/paragraflar/1.3-paragraf.docx
@@ -4494,7 +4494,7 @@
           <w:rFonts w:ascii="Times New Roman" w:hAnsi="Times New Roman" w:cs="Times New Roman" w:eastAsia="Times New Roman"/>
           <w:sz w:val="28"/>
         </w:rPr>
-        <w:t xml:space="preserve">Reyting shkalasi ordinal xarakterga ega, ammo reyting toifalari va defolt ehtimoli o‘rtasida barqaror bog‘liqlik mavjud. Moody’s ma’lumotlariga ko‘ra, reyting pasaygan sari defolt darajasi eksponensial oshib boradi (1.3.6-rasm).</w:t>
+        <w:t xml:space="preserve">Reyting shkalasi ordinal xarakterga ega, ammo reyting toifalari va defolt ehtimoli o‘rtasida barqaror bog‘liqlik mavjud. S&amp;P Global Ratings agentligining 1981–2024-yillar bo‘yicha global korporativ ma’lumotlariga ko‘ra, reyting pasaygan sari defolt darajasi eksponensial oshib boradi: 5 yillik kumulyativ defolt darajasi investitsion toifadagi kompaniyalarda o‘rtacha 0,77 foizni, spekulyativ toifadagilarda esa 13,64 foizni tashkil etgan (1.3.6-rasm).</w:t>
       </w:r>
     </w:p>
     <w:p>
@@ -4537,7 +4537,7 @@
           <w:b/>
           <w:sz w:val="28"/>
         </w:rPr>
-        <w:t xml:space="preserve">1.3.6-rasm. Moody’s reyting toifalari bo‘yicha 5 yillik kumulyativ defolt darajasi, 1983–2006-yillar, %</w:t>
+        <w:t xml:space="preserve">1.3.6-rasm. S&amp;P reyting toifalari bo‘yicha 5 yillik o‘rtacha kumulyativ defolt darajasi, 1981–2024-yillar, %</w:t>
       </w:r>
       <w:r>
         <w:rPr>
@@ -8274,7 +8274,7 @@
         <w:t xml:space="preserve"> </w:t>
       </w:r>
       <w:r>
-        <w:t xml:space="preserve">Muallif tomonidan quyidagi manba asosida tuzilgan: Langohr H., Langohr P. Ko‘rsatilgan asar. – P. 48.</w:t>
+        <w:t xml:space="preserve">Muallif tomonidan quyidagi manba asosida tuzilgan: S&amp;P Global Ratings. Default, Transition, and Recovery: 2024 Annual Global Corporate Default And Rating Transition Study. – March 27, 2025. – P. 55–56 (Table 24).</w:t>
       </w:r>
     </w:p>
   </w:footnote>
@@ -8293,7 +8293,7 @@
         <w:t xml:space="preserve"> </w:t>
       </w:r>
       <w:r>
-        <w:t xml:space="preserve">O‘sha joyda. – P. 341.</w:t>
+        <w:t xml:space="preserve">Langohr H., Langohr P. Ko‘rsatilgan asar. – P. 341.</w:t>
       </w:r>
     </w:p>
   </w:footnote>
@@ -10850,47 +10850,59 @@
           </c:trendline>
           <c:cat>
             <c:strRef>
-              <c:f>Sheet1!$A$2:$A$6</c:f>
+              <c:f>Sheet1!$A$2:$A$8</c:f>
               <c:strCache>
-                <c:ptCount val="5"/>
+                <c:ptCount val="7"/>
                 <c:pt idx="0">
-                  <c:v>Aaa</c:v>
+                  <c:v>AAA</c:v>
                 </c:pt>
                 <c:pt idx="1">
-                  <c:v>Aa2</c:v>
+                  <c:v>AA</c:v>
                 </c:pt>
                 <c:pt idx="2">
-                  <c:v>Baa2</c:v>
+                  <c:v>A</c:v>
                 </c:pt>
                 <c:pt idx="3">
-                  <c:v>Ba2</c:v>
+                  <c:v>BBB</c:v>
                 </c:pt>
                 <c:pt idx="4">
-                  <c:v>B2</c:v>
+                  <c:v>BB</c:v>
+                </c:pt>
+                <c:pt idx="5">
+                  <c:v>B</c:v>
+                </c:pt>
+                <c:pt idx="6">
+                  <c:v>CCC/C</c:v>
                 </c:pt>
               </c:strCache>
             </c:strRef>
           </c:cat>
           <c:val>
             <c:numRef>
-              <c:f>Sheet1!$B$2:$B$6</c:f>
+              <c:f>Sheet1!$B$2:$B$8</c:f>
               <c:numCache>
                 <c:formatCode>General</c:formatCode>
-                <c:ptCount val="5"/>
+                <c:ptCount val="7"/>
                 <c:pt idx="0">
-                  <c:v>0.18</c:v>
+                  <c:v>0.34</c:v>
                 </c:pt>
                 <c:pt idx="1">
                   <c:v>0.28</c:v>
                 </c:pt>
                 <c:pt idx="2">
-                  <c:v>2.11</c:v>
+                  <c:v>0.39</c:v>
                 </c:pt>
                 <c:pt idx="3">
-                  <c:v>8.82</c:v>
+                  <c:v>1.36</c:v>
                 </c:pt>
                 <c:pt idx="4">
-                  <c:v>31.24</c:v>
+                  <c:v>5.75</c:v>
+                </c:pt>
+                <c:pt idx="5">
+                  <c:v>15.6</c:v>
+                </c:pt>
+                <c:pt idx="6">
+                  <c:v>46.53</c:v>
                 </c:pt>
               </c:numCache>
             </c:numRef>
@@ -10929,7 +10941,7 @@
                     </a:solidFill>
                     <a:latin typeface="Times New Roman"/>
                   </a:rPr>
-                  <a:t>Moody’s reyting toifasi</a:t>
+                  <a:t>S&amp;P reyting toifasi</a:t>
                 </a:r>
               </a:p>
             </c:rich>
@@ -10974,7 +10986,7 @@
         <c:axId val="222"/>
         <c:scaling>
           <c:orientation val="minMax"/>
-          <c:max val="35"/>
+          <c:max val="50"/>
           <c:min val="0"/>
         </c:scaling>
         <c:delete val="0"/>
@@ -11047,7 +11059,7 @@
         <c:crossAx val="111"/>
         <c:crosses val="autoZero"/>
         <c:crossBetween val="midCat"/>
-        <c:majorUnit val="5"/>
+        <c:majorUnit val="10"/>
       </c:valAx>
       <c:spPr>
         <a:noFill/>

</xml_diff>